<commit_message>
Add path filtering to avoid duplicate routes
</commit_message>
<xml_diff>
--- a/rapport_final.docx
+++ b/rapport_final.docx
@@ -174,7 +174,9 @@
             <w:shd w:val="clear" w:color="auto" w:fill="A7BFDE"/>
             <w:tcMar/>
           </w:tcPr>
-          <w:p/>
+          <w:p>
+            <w:r/>
+          </w:p>
           <w:tbl>
             <w:tblPr>
               <w:tblStyle w:val="Grilledutableau"/>
@@ -197,7 +199,6 @@
                   <w:r>
                     <w:rPr>
                       <w:b/>
-                      <w:sz w:val="24"/>
                     </w:rPr>
                     <w:t>Méthode</w:t>
                   </w:r>
@@ -211,7 +212,6 @@
                   <w:r>
                     <w:rPr>
                       <w:b/>
-                      <w:sz w:val="24"/>
                     </w:rPr>
                     <w:t>Route</w:t>
                   </w:r>
@@ -225,7 +225,6 @@
                   <w:r>
                     <w:rPr>
                       <w:b/>
-                      <w:sz w:val="24"/>
                     </w:rPr>
                     <w:t>Paramètre</w:t>
                   </w:r>
@@ -239,7 +238,6 @@
                   <w:r>
                     <w:rPr>
                       <w:b/>
-                      <w:sz w:val="24"/>
                     </w:rPr>
                     <w:t>Profils concernés par cette fonctionnalité</w:t>
                   </w:r>
@@ -253,7 +251,6 @@
                   <w:r>
                     <w:rPr>
                       <w:b/>
-                      <w:sz w:val="24"/>
                     </w:rPr>
                     <w:t>Profils usurpant la fonctionnalité</w:t>
                   </w:r>
@@ -277,7 +274,7 @@
                 </w:tcPr>
                 <w:p>
                   <w:r>
-                    <w:t>/_wdt/5a23f4</w:t>
+                    <w:t>/tests</w:t>
                   </w:r>
                 </w:p>
               </w:tc>
@@ -295,7 +292,7 @@
                 </w:tcPr>
                 <w:p>
                   <w:r>
-                    <w:t>SAILME, NonAuth</w:t>
+                    <w:t>SAILME</w:t>
                   </w:r>
                 </w:p>
               </w:tc>
@@ -327,7 +324,111 @@
                 </w:tcPr>
                 <w:p>
                   <w:r>
-                    <w:t>/_wdt/6a0451</w:t>
+                    <w:t>/oui</w:t>
+                  </w:r>
+                </w:p>
+              </w:tc>
+              <w:tc>
+                <w:tcPr>
+                  <w:tcW w:type="dxa" w:w="1770"/>
+                </w:tcPr>
+                <w:p>
+                  <w:r>
+                    <w:t>param=</w:t>
+                  </w:r>
+                </w:p>
+              </w:tc>
+              <w:tc>
+                <w:tcPr>
+                  <w:tcW w:type="dxa" w:w="1770"/>
+                </w:tcPr>
+                <w:p>
+                  <w:r>
+                    <w:t>SAILME</w:t>
+                  </w:r>
+                </w:p>
+              </w:tc>
+              <w:tc>
+                <w:tcPr>
+                  <w:tcW w:type="dxa" w:w="1770"/>
+                </w:tcPr>
+                <w:p>
+                  <w:r>
+                    <w:t>Ecole</w:t>
+                  </w:r>
+                </w:p>
+              </w:tc>
+            </w:tr>
+            <w:tr>
+              <w:tc>
+                <w:tcPr>
+                  <w:tcW w:type="dxa" w:w="1770"/>
+                </w:tcPr>
+                <w:p>
+                  <w:r>
+                    <w:t>GET</w:t>
+                  </w:r>
+                </w:p>
+              </w:tc>
+              <w:tc>
+                <w:tcPr>
+                  <w:tcW w:type="dxa" w:w="1770"/>
+                </w:tcPr>
+                <w:p>
+                  <w:r>
+                    <w:t>/oui</w:t>
+                  </w:r>
+                </w:p>
+              </w:tc>
+              <w:tc>
+                <w:tcPr>
+                  <w:tcW w:type="dxa" w:w="1770"/>
+                </w:tcPr>
+                <w:p>
+                  <w:r>
+                    <w:t>test=</w:t>
+                  </w:r>
+                </w:p>
+              </w:tc>
+              <w:tc>
+                <w:tcPr>
+                  <w:tcW w:type="dxa" w:w="1770"/>
+                </w:tcPr>
+                <w:p>
+                  <w:r>
+                    <w:t>SAILME</w:t>
+                  </w:r>
+                </w:p>
+              </w:tc>
+              <w:tc>
+                <w:tcPr>
+                  <w:tcW w:type="dxa" w:w="1770"/>
+                </w:tcPr>
+                <w:p>
+                  <w:r>
+                    <w:t>Ecole</w:t>
+                  </w:r>
+                </w:p>
+              </w:tc>
+            </w:tr>
+            <w:tr>
+              <w:tc>
+                <w:tcPr>
+                  <w:tcW w:type="dxa" w:w="1770"/>
+                </w:tcPr>
+                <w:p>
+                  <w:r>
+                    <w:t>GET</w:t>
+                  </w:r>
+                </w:p>
+              </w:tc>
+              <w:tc>
+                <w:tcPr>
+                  <w:tcW w:type="dxa" w:w="1770"/>
+                </w:tcPr>
+                <w:p>
+                  <w:r>
+                    <w:t>/oui</w:t>
                   </w:r>
                 </w:p>
               </w:tc>
@@ -355,253 +456,7 @@
                 </w:tcPr>
                 <w:p>
                   <w:r>
-                    <w:t>Ecole, NonAuth</w:t>
-                  </w:r>
-                </w:p>
-              </w:tc>
-            </w:tr>
-            <w:tr>
-              <w:tc>
-                <w:tcPr>
-                  <w:tcW w:type="dxa" w:w="1770"/>
-                </w:tcPr>
-                <w:p>
-                  <w:r>
-                    <w:t>GET</w:t>
-                  </w:r>
-                </w:p>
-              </w:tc>
-              <w:tc>
-                <w:tcPr>
-                  <w:tcW w:type="dxa" w:w="1770"/>
-                </w:tcPr>
-                <w:p>
-                  <w:r>
-                    <w:t>/_wdt/71d7df</w:t>
-                  </w:r>
-                </w:p>
-              </w:tc>
-              <w:tc>
-                <w:tcPr>
-                  <w:tcW w:type="dxa" w:w="1770"/>
-                </w:tcPr>
-                <w:p>
-                  <w:r/>
-                </w:p>
-              </w:tc>
-              <w:tc>
-                <w:tcPr>
-                  <w:tcW w:type="dxa" w:w="1770"/>
-                </w:tcPr>
-                <w:p>
-                  <w:r>
                     <w:t>Ecole</w:t>
-                  </w:r>
-                </w:p>
-              </w:tc>
-              <w:tc>
-                <w:tcPr>
-                  <w:tcW w:type="dxa" w:w="1770"/>
-                </w:tcPr>
-                <w:p>
-                  <w:r>
-                    <w:t>SAILME, NonAuth</w:t>
-                  </w:r>
-                </w:p>
-              </w:tc>
-            </w:tr>
-            <w:tr>
-              <w:tc>
-                <w:tcPr>
-                  <w:tcW w:type="dxa" w:w="1770"/>
-                </w:tcPr>
-                <w:p>
-                  <w:r>
-                    <w:t>POST</w:t>
-                  </w:r>
-                </w:p>
-              </w:tc>
-              <w:tc>
-                <w:tcPr>
-                  <w:tcW w:type="dxa" w:w="1770"/>
-                </w:tcPr>
-                <w:p>
-                  <w:r>
-                    <w:t>/login</w:t>
-                  </w:r>
-                </w:p>
-              </w:tc>
-              <w:tc>
-                <w:tcPr>
-                  <w:tcW w:type="dxa" w:w="1770"/>
-                </w:tcPr>
-                <w:p>
-                  <w:r/>
-                </w:p>
-              </w:tc>
-              <w:tc>
-                <w:tcPr>
-                  <w:tcW w:type="dxa" w:w="1770"/>
-                </w:tcPr>
-                <w:p>
-                  <w:r/>
-                </w:p>
-              </w:tc>
-              <w:tc>
-                <w:tcPr>
-                  <w:tcW w:type="dxa" w:w="1770"/>
-                </w:tcPr>
-                <w:p>
-                  <w:r>
-                    <w:t>Ecole, SAILME, NonAuth</w:t>
-                  </w:r>
-                </w:p>
-              </w:tc>
-            </w:tr>
-            <w:tr>
-              <w:tc>
-                <w:tcPr>
-                  <w:tcW w:type="dxa" w:w="1770"/>
-                </w:tcPr>
-                <w:p>
-                  <w:r>
-                    <w:t>GET</w:t>
-                  </w:r>
-                </w:p>
-              </w:tc>
-              <w:tc>
-                <w:tcPr>
-                  <w:tcW w:type="dxa" w:w="1770"/>
-                </w:tcPr>
-                <w:p>
-                  <w:r>
-                    <w:t>/_wdt/344b6e</w:t>
-                  </w:r>
-                </w:p>
-              </w:tc>
-              <w:tc>
-                <w:tcPr>
-                  <w:tcW w:type="dxa" w:w="1770"/>
-                </w:tcPr>
-                <w:p>
-                  <w:r/>
-                </w:p>
-              </w:tc>
-              <w:tc>
-                <w:tcPr>
-                  <w:tcW w:type="dxa" w:w="1770"/>
-                </w:tcPr>
-                <w:p>
-                  <w:r>
-                    <w:t>Ecole</w:t>
-                  </w:r>
-                </w:p>
-              </w:tc>
-              <w:tc>
-                <w:tcPr>
-                  <w:tcW w:type="dxa" w:w="1770"/>
-                </w:tcPr>
-                <w:p>
-                  <w:r>
-                    <w:t>SAILME, NonAuth</w:t>
-                  </w:r>
-                </w:p>
-              </w:tc>
-            </w:tr>
-            <w:tr>
-              <w:tc>
-                <w:tcPr>
-                  <w:tcW w:type="dxa" w:w="1770"/>
-                </w:tcPr>
-                <w:p>
-                  <w:r>
-                    <w:t>GET</w:t>
-                  </w:r>
-                </w:p>
-              </w:tc>
-              <w:tc>
-                <w:tcPr>
-                  <w:tcW w:type="dxa" w:w="1770"/>
-                </w:tcPr>
-                <w:p>
-                  <w:r>
-                    <w:t>/login</w:t>
-                  </w:r>
-                </w:p>
-              </w:tc>
-              <w:tc>
-                <w:tcPr>
-                  <w:tcW w:type="dxa" w:w="1770"/>
-                </w:tcPr>
-                <w:p>
-                  <w:r/>
-                </w:p>
-              </w:tc>
-              <w:tc>
-                <w:tcPr>
-                  <w:tcW w:type="dxa" w:w="1770"/>
-                </w:tcPr>
-                <w:p>
-                  <w:r>
-                    <w:t>SAILME</w:t>
-                  </w:r>
-                </w:p>
-              </w:tc>
-              <w:tc>
-                <w:tcPr>
-                  <w:tcW w:type="dxa" w:w="1770"/>
-                </w:tcPr>
-                <w:p>
-                  <w:r>
-                    <w:t>Ecole, NonAuth</w:t>
-                  </w:r>
-                </w:p>
-              </w:tc>
-            </w:tr>
-            <w:tr>
-              <w:tc>
-                <w:tcPr>
-                  <w:tcW w:type="dxa" w:w="1770"/>
-                </w:tcPr>
-                <w:p>
-                  <w:r>
-                    <w:t>GET</w:t>
-                  </w:r>
-                </w:p>
-              </w:tc>
-              <w:tc>
-                <w:tcPr>
-                  <w:tcW w:type="dxa" w:w="1770"/>
-                </w:tcPr>
-                <w:p>
-                  <w:r>
-                    <w:t>/admin/orders</w:t>
-                  </w:r>
-                </w:p>
-              </w:tc>
-              <w:tc>
-                <w:tcPr>
-                  <w:tcW w:type="dxa" w:w="1770"/>
-                </w:tcPr>
-                <w:p>
-                  <w:r/>
-                </w:p>
-              </w:tc>
-              <w:tc>
-                <w:tcPr>
-                  <w:tcW w:type="dxa" w:w="1770"/>
-                </w:tcPr>
-                <w:p>
-                  <w:r/>
-                </w:p>
-              </w:tc>
-              <w:tc>
-                <w:tcPr>
-                  <w:tcW w:type="dxa" w:w="1770"/>
-                </w:tcPr>
-                <w:p>
-                  <w:r>
-                    <w:t>Ecole, SAILME, NonAuth</w:t>
                   </w:r>
                 </w:p>
               </w:tc>
@@ -737,29 +592,15 @@
               <w:br/>
               <w:t>Il est nécessaire de mettre en place un contrôle d’accès sur les fonctionnalités suivantes :</w:t>
               <w:br/>
-              <w:t xml:space="preserve">- /provideItems </w:t>
-              <w:br/>
-              <w:t xml:space="preserve">- /_wdt/5a23f4 </w:t>
-              <w:br/>
-              <w:t xml:space="preserve">- /catalog </w:t>
-              <w:br/>
-              <w:t xml:space="preserve">- /_wdt/6a0451 </w:t>
-              <w:br/>
-              <w:t xml:space="preserve">- / </w:t>
-              <w:br/>
-              <w:t xml:space="preserve">- /profile </w:t>
-              <w:br/>
-              <w:t xml:space="preserve">- /_wdt/71d7df </w:t>
-              <w:br/>
-              <w:t xml:space="preserve">- /profile </w:t>
-              <w:br/>
-              <w:t xml:space="preserve">- /login </w:t>
-              <w:br/>
-              <w:t xml:space="preserve">- /_wdt/344b6e </w:t>
-              <w:br/>
-              <w:t xml:space="preserve">- /login </w:t>
-              <w:br/>
-              <w:t xml:space="preserve">- /admin/orders </w:t>
+              <w:t xml:space="preserve">- /tests </w:t>
+              <w:br/>
+              <w:t xml:space="preserve">- /oui?param= </w:t>
+              <w:br/>
+              <w:t xml:space="preserve">- /oui?test= </w:t>
+              <w:br/>
+              <w:t xml:space="preserve">- /oui </w:t>
+              <w:br/>
+              <w:t xml:space="preserve">- /tests?param= </w:t>
               <w:br/>
               <w:br/>
               <w:br/>

</xml_diff>